<commit_message>
Add RAG pipeline with pgvector semantic search
</commit_message>
<xml_diff>
--- a/Customer Agent Project.docx
+++ b/Customer Agent Project.docx
@@ -2668,6 +2668,951 @@
         </w:tc>
       </w:tr>
     </w:tbl>
+    <w:p>
+      <w:pPr>
+        <w:spacing w:before="100" w:beforeAutospacing="1" w:after="100" w:afterAutospacing="1" w:line="240" w:lineRule="auto"/>
+        <w:outlineLvl w:val="2"/>
+        <w:rPr>
+          <w:rFonts w:eastAsia="Times New Roman" w:cs="Times New Roman"/>
+          <w:b/>
+          <w:bCs/>
+          <w:color w:val="000000"/>
+          <w:kern w:val="0"/>
+          <w14:ligatures w14:val="none"/>
+        </w:rPr>
+      </w:pPr>
+      <w:r>
+        <w:rPr>
+          <w:rFonts w:eastAsia="Times New Roman" w:cs="Times New Roman"/>
+          <w:b/>
+          <w:bCs/>
+          <w:color w:val="000000"/>
+          <w:kern w:val="0"/>
+          <w14:ligatures w14:val="none"/>
+        </w:rPr>
+        <w:lastRenderedPageBreak/>
+        <w:t xml:space="preserve">Real Example </w:t>
+      </w:r>
+      <w:proofErr w:type="gramStart"/>
+      <w:r>
+        <w:rPr>
+          <w:rFonts w:eastAsia="Times New Roman" w:cs="Times New Roman"/>
+          <w:b/>
+          <w:bCs/>
+          <w:color w:val="000000"/>
+          <w:kern w:val="0"/>
+          <w14:ligatures w14:val="none"/>
+        </w:rPr>
+        <w:t>From</w:t>
+      </w:r>
+      <w:proofErr w:type="gramEnd"/>
+      <w:r>
+        <w:rPr>
+          <w:rFonts w:eastAsia="Times New Roman" w:cs="Times New Roman"/>
+          <w:b/>
+          <w:bCs/>
+          <w:color w:val="000000"/>
+          <w:kern w:val="0"/>
+          <w14:ligatures w14:val="none"/>
+        </w:rPr>
+        <w:t xml:space="preserve"> Your Project</w:t>
+      </w:r>
+    </w:p>
+    <w:p>
+      <w:pPr>
+        <w:spacing w:before="100" w:beforeAutospacing="1" w:after="100" w:afterAutospacing="1" w:line="240" w:lineRule="auto"/>
+        <w:rPr>
+          <w:rFonts w:eastAsia="Times New Roman" w:cs="Times New Roman"/>
+          <w:color w:val="000000"/>
+          <w:kern w:val="0"/>
+          <w14:ligatures w14:val="none"/>
+        </w:rPr>
+      </w:pPr>
+      <w:r>
+        <w:rPr>
+          <w:rFonts w:eastAsia="Times New Roman" w:cs="Times New Roman"/>
+          <w:color w:val="000000"/>
+          <w:kern w:val="0"/>
+          <w14:ligatures w14:val="none"/>
+        </w:rPr>
+        <w:t>When customer says:</w:t>
+      </w:r>
+    </w:p>
+    <w:p>
+      <w:pPr>
+        <w:spacing w:before="100" w:beforeAutospacing="1" w:after="100" w:afterAutospacing="1" w:line="240" w:lineRule="auto"/>
+        <w:rPr>
+          <w:rFonts w:eastAsia="Times New Roman" w:cs="Times New Roman"/>
+          <w:color w:val="000000"/>
+          <w:kern w:val="0"/>
+          <w14:ligatures w14:val="none"/>
+        </w:rPr>
+      </w:pPr>
+      <w:r>
+        <w:rPr>
+          <w:rFonts w:eastAsia="Times New Roman" w:cs="Times New Roman"/>
+          <w:color w:val="000000"/>
+          <w:kern w:val="0"/>
+          <w14:ligatures w14:val="none"/>
+        </w:rPr>
+        <w:t>"I am frustrated! My bill is wrong!"</w:t>
+      </w:r>
+    </w:p>
+    <w:p>
+      <w:pPr>
+        <w:spacing w:before="100" w:beforeAutospacing="1" w:after="100" w:afterAutospacing="1" w:line="240" w:lineRule="auto"/>
+        <w:rPr>
+          <w:rFonts w:eastAsia="Times New Roman" w:cs="Times New Roman"/>
+          <w:color w:val="000000"/>
+          <w:kern w:val="0"/>
+          <w14:ligatures w14:val="none"/>
+        </w:rPr>
+      </w:pPr>
+      <w:proofErr w:type="spellStart"/>
+      <w:r>
+        <w:rPr>
+          <w:rFonts w:eastAsia="Times New Roman" w:cs="Times New Roman"/>
+          <w:b/>
+          <w:bCs/>
+          <w:color w:val="000000"/>
+          <w:kern w:val="0"/>
+          <w14:ligatures w14:val="none"/>
+        </w:rPr>
+        <w:t>LangChain</w:t>
+      </w:r>
+      <w:proofErr w:type="spellEnd"/>
+      <w:r>
+        <w:rPr>
+          <w:rFonts w:eastAsia="Times New Roman" w:cs="Times New Roman"/>
+          <w:b/>
+          <w:bCs/>
+          <w:color w:val="000000"/>
+          <w:kern w:val="0"/>
+          <w14:ligatures w14:val="none"/>
+        </w:rPr>
+        <w:t xml:space="preserve"> takes over:</w:t>
+      </w:r>
+    </w:p>
+    <w:p>
+      <w:pPr>
+        <w:tabs>
+          <w:tab w:val="left" w:pos="916"/>
+          <w:tab w:val="left" w:pos="1832"/>
+          <w:tab w:val="left" w:pos="2748"/>
+          <w:tab w:val="left" w:pos="3664"/>
+          <w:tab w:val="left" w:pos="4580"/>
+          <w:tab w:val="left" w:pos="5496"/>
+          <w:tab w:val="left" w:pos="6412"/>
+          <w:tab w:val="left" w:pos="7328"/>
+          <w:tab w:val="left" w:pos="8244"/>
+          <w:tab w:val="left" w:pos="9160"/>
+          <w:tab w:val="left" w:pos="10076"/>
+          <w:tab w:val="left" w:pos="10992"/>
+          <w:tab w:val="left" w:pos="11908"/>
+          <w:tab w:val="left" w:pos="12824"/>
+          <w:tab w:val="left" w:pos="13740"/>
+          <w:tab w:val="left" w:pos="14656"/>
+        </w:tabs>
+        <w:spacing w:after="0" w:line="240" w:lineRule="auto"/>
+        <w:rPr>
+          <w:rFonts w:eastAsia="Times New Roman" w:cs="Courier New"/>
+          <w:color w:val="14181F"/>
+          <w:kern w:val="0"/>
+          <w14:ligatures w14:val="none"/>
+        </w:rPr>
+      </w:pPr>
+      <w:r>
+        <w:rPr>
+          <w:rFonts w:eastAsia="Times New Roman" w:cs="Courier New"/>
+          <w:color w:val="14181F"/>
+          <w:kern w:val="0"/>
+          <w14:ligatures w14:val="none"/>
+        </w:rPr>
+        <w:t xml:space="preserve">Step 1 — </w:t>
+      </w:r>
+      <w:proofErr w:type="spellStart"/>
+      <w:r>
+        <w:rPr>
+          <w:rFonts w:eastAsia="Times New Roman" w:cs="Courier New"/>
+          <w:color w:val="14181F"/>
+          <w:kern w:val="0"/>
+          <w14:ligatures w14:val="none"/>
+        </w:rPr>
+        <w:t>LangChain</w:t>
+      </w:r>
+      <w:proofErr w:type="spellEnd"/>
+      <w:r>
+        <w:rPr>
+          <w:rFonts w:eastAsia="Times New Roman" w:cs="Courier New"/>
+          <w:color w:val="14181F"/>
+          <w:kern w:val="0"/>
+          <w14:ligatures w14:val="none"/>
+        </w:rPr>
+        <w:t xml:space="preserve"> receives the message</w:t>
+      </w:r>
+    </w:p>
+    <w:p>
+      <w:pPr>
+        <w:tabs>
+          <w:tab w:val="left" w:pos="916"/>
+          <w:tab w:val="left" w:pos="1832"/>
+          <w:tab w:val="left" w:pos="2748"/>
+          <w:tab w:val="left" w:pos="3664"/>
+          <w:tab w:val="left" w:pos="4580"/>
+          <w:tab w:val="left" w:pos="5496"/>
+          <w:tab w:val="left" w:pos="6412"/>
+          <w:tab w:val="left" w:pos="7328"/>
+          <w:tab w:val="left" w:pos="8244"/>
+          <w:tab w:val="left" w:pos="9160"/>
+          <w:tab w:val="left" w:pos="10076"/>
+          <w:tab w:val="left" w:pos="10992"/>
+          <w:tab w:val="left" w:pos="11908"/>
+          <w:tab w:val="left" w:pos="12824"/>
+          <w:tab w:val="left" w:pos="13740"/>
+          <w:tab w:val="left" w:pos="14656"/>
+        </w:tabs>
+        <w:spacing w:after="0" w:line="240" w:lineRule="auto"/>
+        <w:rPr>
+          <w:rFonts w:eastAsia="Times New Roman" w:cs="Courier New"/>
+          <w:color w:val="14181F"/>
+          <w:kern w:val="0"/>
+          <w14:ligatures w14:val="none"/>
+        </w:rPr>
+      </w:pPr>
+      <w:r>
+        <w:rPr>
+          <w:rFonts w:eastAsia="Times New Roman" w:cs="Courier New"/>
+          <w:color w:val="14181F"/>
+          <w:kern w:val="0"/>
+          <w14:ligatures w14:val="none"/>
+        </w:rPr>
+        <w:t xml:space="preserve">Step 2 — </w:t>
+      </w:r>
+      <w:proofErr w:type="spellStart"/>
+      <w:r>
+        <w:rPr>
+          <w:rFonts w:eastAsia="Times New Roman" w:cs="Courier New"/>
+          <w:color w:val="14181F"/>
+          <w:kern w:val="0"/>
+          <w14:ligatures w14:val="none"/>
+        </w:rPr>
+        <w:t>LangChain</w:t>
+      </w:r>
+      <w:proofErr w:type="spellEnd"/>
+      <w:r>
+        <w:rPr>
+          <w:rFonts w:eastAsia="Times New Roman" w:cs="Courier New"/>
+          <w:color w:val="14181F"/>
+          <w:kern w:val="0"/>
+          <w14:ligatures w14:val="none"/>
+        </w:rPr>
+        <w:t xml:space="preserve"> asks Groq: "What should I do first?"</w:t>
+      </w:r>
+    </w:p>
+    <w:p>
+      <w:pPr>
+        <w:tabs>
+          <w:tab w:val="left" w:pos="916"/>
+          <w:tab w:val="left" w:pos="1832"/>
+          <w:tab w:val="left" w:pos="2748"/>
+          <w:tab w:val="left" w:pos="3664"/>
+          <w:tab w:val="left" w:pos="4580"/>
+          <w:tab w:val="left" w:pos="5496"/>
+          <w:tab w:val="left" w:pos="6412"/>
+          <w:tab w:val="left" w:pos="7328"/>
+          <w:tab w:val="left" w:pos="8244"/>
+          <w:tab w:val="left" w:pos="9160"/>
+          <w:tab w:val="left" w:pos="10076"/>
+          <w:tab w:val="left" w:pos="10992"/>
+          <w:tab w:val="left" w:pos="11908"/>
+          <w:tab w:val="left" w:pos="12824"/>
+          <w:tab w:val="left" w:pos="13740"/>
+          <w:tab w:val="left" w:pos="14656"/>
+        </w:tabs>
+        <w:spacing w:after="0" w:line="240" w:lineRule="auto"/>
+        <w:rPr>
+          <w:rFonts w:eastAsia="Times New Roman" w:cs="Courier New"/>
+          <w:color w:val="14181F"/>
+          <w:kern w:val="0"/>
+          <w14:ligatures w14:val="none"/>
+        </w:rPr>
+      </w:pPr>
+      <w:r>
+        <w:rPr>
+          <w:rFonts w:eastAsia="Times New Roman" w:cs="Courier New"/>
+          <w:color w:val="14181F"/>
+          <w:kern w:val="0"/>
+          <w14:ligatures w14:val="none"/>
+        </w:rPr>
+        <w:t xml:space="preserve">Step 3 — </w:t>
+      </w:r>
+      <w:proofErr w:type="spellStart"/>
+      <w:r>
+        <w:rPr>
+          <w:rFonts w:eastAsia="Times New Roman" w:cs="Courier New"/>
+          <w:color w:val="14181F"/>
+          <w:kern w:val="0"/>
+          <w14:ligatures w14:val="none"/>
+        </w:rPr>
+        <w:t>Groq</w:t>
+      </w:r>
+      <w:proofErr w:type="spellEnd"/>
+      <w:r>
+        <w:rPr>
+          <w:rFonts w:eastAsia="Times New Roman" w:cs="Courier New"/>
+          <w:color w:val="14181F"/>
+          <w:kern w:val="0"/>
+          <w14:ligatures w14:val="none"/>
+        </w:rPr>
+        <w:t xml:space="preserve"> thinks and says: "Check sentiment"</w:t>
+      </w:r>
+    </w:p>
+    <w:p>
+      <w:pPr>
+        <w:tabs>
+          <w:tab w:val="left" w:pos="916"/>
+          <w:tab w:val="left" w:pos="1832"/>
+          <w:tab w:val="left" w:pos="2748"/>
+          <w:tab w:val="left" w:pos="3664"/>
+          <w:tab w:val="left" w:pos="4580"/>
+          <w:tab w:val="left" w:pos="5496"/>
+          <w:tab w:val="left" w:pos="6412"/>
+          <w:tab w:val="left" w:pos="7328"/>
+          <w:tab w:val="left" w:pos="8244"/>
+          <w:tab w:val="left" w:pos="9160"/>
+          <w:tab w:val="left" w:pos="10076"/>
+          <w:tab w:val="left" w:pos="10992"/>
+          <w:tab w:val="left" w:pos="11908"/>
+          <w:tab w:val="left" w:pos="12824"/>
+          <w:tab w:val="left" w:pos="13740"/>
+          <w:tab w:val="left" w:pos="14656"/>
+        </w:tabs>
+        <w:spacing w:after="0" w:line="240" w:lineRule="auto"/>
+        <w:rPr>
+          <w:rFonts w:eastAsia="Times New Roman" w:cs="Courier New"/>
+          <w:color w:val="14181F"/>
+          <w:kern w:val="0"/>
+          <w14:ligatures w14:val="none"/>
+        </w:rPr>
+      </w:pPr>
+      <w:r>
+        <w:rPr>
+          <w:rFonts w:eastAsia="Times New Roman" w:cs="Courier New"/>
+          <w:color w:val="14181F"/>
+          <w:kern w:val="0"/>
+          <w14:ligatures w14:val="none"/>
+        </w:rPr>
+        <w:t xml:space="preserve">Step 4 — </w:t>
+      </w:r>
+      <w:proofErr w:type="spellStart"/>
+      <w:r>
+        <w:rPr>
+          <w:rFonts w:eastAsia="Times New Roman" w:cs="Courier New"/>
+          <w:color w:val="14181F"/>
+          <w:kern w:val="0"/>
+          <w14:ligatures w14:val="none"/>
+        </w:rPr>
+        <w:t>LangChain</w:t>
+      </w:r>
+      <w:proofErr w:type="spellEnd"/>
+      <w:r>
+        <w:rPr>
+          <w:rFonts w:eastAsia="Times New Roman" w:cs="Courier New"/>
+          <w:color w:val="14181F"/>
+          <w:kern w:val="0"/>
+          <w14:ligatures w14:val="none"/>
+        </w:rPr>
+        <w:t xml:space="preserve"> runs </w:t>
+      </w:r>
+      <w:proofErr w:type="spellStart"/>
+      <w:r>
+        <w:rPr>
+          <w:rFonts w:eastAsia="Times New Roman" w:cs="Courier New"/>
+          <w:color w:val="14181F"/>
+          <w:kern w:val="0"/>
+          <w14:ligatures w14:val="none"/>
+        </w:rPr>
+        <w:t>check_sentiment</w:t>
+      </w:r>
+      <w:proofErr w:type="spellEnd"/>
+      <w:r>
+        <w:rPr>
+          <w:rFonts w:eastAsia="Times New Roman" w:cs="Courier New"/>
+          <w:color w:val="14181F"/>
+          <w:kern w:val="0"/>
+          <w14:ligatures w14:val="none"/>
+        </w:rPr>
+        <w:t xml:space="preserve"> tool</w:t>
+      </w:r>
+    </w:p>
+    <w:p>
+      <w:pPr>
+        <w:tabs>
+          <w:tab w:val="left" w:pos="916"/>
+          <w:tab w:val="left" w:pos="1832"/>
+          <w:tab w:val="left" w:pos="2748"/>
+          <w:tab w:val="left" w:pos="3664"/>
+          <w:tab w:val="left" w:pos="4580"/>
+          <w:tab w:val="left" w:pos="5496"/>
+          <w:tab w:val="left" w:pos="6412"/>
+          <w:tab w:val="left" w:pos="7328"/>
+          <w:tab w:val="left" w:pos="8244"/>
+          <w:tab w:val="left" w:pos="9160"/>
+          <w:tab w:val="left" w:pos="10076"/>
+          <w:tab w:val="left" w:pos="10992"/>
+          <w:tab w:val="left" w:pos="11908"/>
+          <w:tab w:val="left" w:pos="12824"/>
+          <w:tab w:val="left" w:pos="13740"/>
+          <w:tab w:val="left" w:pos="14656"/>
+        </w:tabs>
+        <w:spacing w:after="0" w:line="240" w:lineRule="auto"/>
+        <w:rPr>
+          <w:rFonts w:eastAsia="Times New Roman" w:cs="Courier New"/>
+          <w:color w:val="14181F"/>
+          <w:kern w:val="0"/>
+          <w14:ligatures w14:val="none"/>
+        </w:rPr>
+      </w:pPr>
+      <w:r>
+        <w:rPr>
+          <w:rFonts w:eastAsia="Times New Roman" w:cs="Courier New"/>
+          <w:color w:val="14181F"/>
+          <w:kern w:val="0"/>
+          <w14:ligatures w14:val="none"/>
+        </w:rPr>
+        <w:t xml:space="preserve">Step 5 — </w:t>
+      </w:r>
+      <w:proofErr w:type="spellStart"/>
+      <w:r>
+        <w:rPr>
+          <w:rFonts w:eastAsia="Times New Roman" w:cs="Courier New"/>
+          <w:color w:val="14181F"/>
+          <w:kern w:val="0"/>
+          <w14:ligatures w14:val="none"/>
+        </w:rPr>
+        <w:t>LangChain</w:t>
+      </w:r>
+      <w:proofErr w:type="spellEnd"/>
+      <w:r>
+        <w:rPr>
+          <w:rFonts w:eastAsia="Times New Roman" w:cs="Courier New"/>
+          <w:color w:val="14181F"/>
+          <w:kern w:val="0"/>
+          <w14:ligatures w14:val="none"/>
+        </w:rPr>
+        <w:t xml:space="preserve"> asks Groq: "What next?"</w:t>
+      </w:r>
+    </w:p>
+    <w:p>
+      <w:pPr>
+        <w:tabs>
+          <w:tab w:val="left" w:pos="916"/>
+          <w:tab w:val="left" w:pos="1832"/>
+          <w:tab w:val="left" w:pos="2748"/>
+          <w:tab w:val="left" w:pos="3664"/>
+          <w:tab w:val="left" w:pos="4580"/>
+          <w:tab w:val="left" w:pos="5496"/>
+          <w:tab w:val="left" w:pos="6412"/>
+          <w:tab w:val="left" w:pos="7328"/>
+          <w:tab w:val="left" w:pos="8244"/>
+          <w:tab w:val="left" w:pos="9160"/>
+          <w:tab w:val="left" w:pos="10076"/>
+          <w:tab w:val="left" w:pos="10992"/>
+          <w:tab w:val="left" w:pos="11908"/>
+          <w:tab w:val="left" w:pos="12824"/>
+          <w:tab w:val="left" w:pos="13740"/>
+          <w:tab w:val="left" w:pos="14656"/>
+        </w:tabs>
+        <w:spacing w:after="0" w:line="240" w:lineRule="auto"/>
+        <w:rPr>
+          <w:rFonts w:eastAsia="Times New Roman" w:cs="Courier New"/>
+          <w:color w:val="14181F"/>
+          <w:kern w:val="0"/>
+          <w14:ligatures w14:val="none"/>
+        </w:rPr>
+      </w:pPr>
+      <w:r>
+        <w:rPr>
+          <w:rFonts w:eastAsia="Times New Roman" w:cs="Courier New"/>
+          <w:color w:val="14181F"/>
+          <w:kern w:val="0"/>
+          <w14:ligatures w14:val="none"/>
+        </w:rPr>
+        <w:t xml:space="preserve">Step 6 — </w:t>
+      </w:r>
+      <w:proofErr w:type="spellStart"/>
+      <w:r>
+        <w:rPr>
+          <w:rFonts w:eastAsia="Times New Roman" w:cs="Courier New"/>
+          <w:color w:val="14181F"/>
+          <w:kern w:val="0"/>
+          <w14:ligatures w14:val="none"/>
+        </w:rPr>
+        <w:t>Groq</w:t>
+      </w:r>
+      <w:proofErr w:type="spellEnd"/>
+      <w:r>
+        <w:rPr>
+          <w:rFonts w:eastAsia="Times New Roman" w:cs="Courier New"/>
+          <w:color w:val="14181F"/>
+          <w:kern w:val="0"/>
+          <w14:ligatures w14:val="none"/>
+        </w:rPr>
+        <w:t xml:space="preserve"> says: "Search billing knowledge base"</w:t>
+      </w:r>
+    </w:p>
+    <w:p>
+      <w:pPr>
+        <w:tabs>
+          <w:tab w:val="left" w:pos="916"/>
+          <w:tab w:val="left" w:pos="1832"/>
+          <w:tab w:val="left" w:pos="2748"/>
+          <w:tab w:val="left" w:pos="3664"/>
+          <w:tab w:val="left" w:pos="4580"/>
+          <w:tab w:val="left" w:pos="5496"/>
+          <w:tab w:val="left" w:pos="6412"/>
+          <w:tab w:val="left" w:pos="7328"/>
+          <w:tab w:val="left" w:pos="8244"/>
+          <w:tab w:val="left" w:pos="9160"/>
+          <w:tab w:val="left" w:pos="10076"/>
+          <w:tab w:val="left" w:pos="10992"/>
+          <w:tab w:val="left" w:pos="11908"/>
+          <w:tab w:val="left" w:pos="12824"/>
+          <w:tab w:val="left" w:pos="13740"/>
+          <w:tab w:val="left" w:pos="14656"/>
+        </w:tabs>
+        <w:spacing w:after="0" w:line="240" w:lineRule="auto"/>
+        <w:rPr>
+          <w:rFonts w:eastAsia="Times New Roman" w:cs="Courier New"/>
+          <w:color w:val="14181F"/>
+          <w:kern w:val="0"/>
+          <w14:ligatures w14:val="none"/>
+        </w:rPr>
+      </w:pPr>
+      <w:r>
+        <w:rPr>
+          <w:rFonts w:eastAsia="Times New Roman" w:cs="Courier New"/>
+          <w:color w:val="14181F"/>
+          <w:kern w:val="0"/>
+          <w14:ligatures w14:val="none"/>
+        </w:rPr>
+        <w:t xml:space="preserve">Step 7 — </w:t>
+      </w:r>
+      <w:proofErr w:type="spellStart"/>
+      <w:r>
+        <w:rPr>
+          <w:rFonts w:eastAsia="Times New Roman" w:cs="Courier New"/>
+          <w:color w:val="14181F"/>
+          <w:kern w:val="0"/>
+          <w14:ligatures w14:val="none"/>
+        </w:rPr>
+        <w:t>LangChain</w:t>
+      </w:r>
+      <w:proofErr w:type="spellEnd"/>
+      <w:r>
+        <w:rPr>
+          <w:rFonts w:eastAsia="Times New Roman" w:cs="Courier New"/>
+          <w:color w:val="14181F"/>
+          <w:kern w:val="0"/>
+          <w14:ligatures w14:val="none"/>
+        </w:rPr>
+        <w:t xml:space="preserve"> runs </w:t>
+      </w:r>
+      <w:proofErr w:type="spellStart"/>
+      <w:r>
+        <w:rPr>
+          <w:rFonts w:eastAsia="Times New Roman" w:cs="Courier New"/>
+          <w:color w:val="14181F"/>
+          <w:kern w:val="0"/>
+          <w14:ligatures w14:val="none"/>
+        </w:rPr>
+        <w:t>search_kb</w:t>
+      </w:r>
+      <w:proofErr w:type="spellEnd"/>
+      <w:r>
+        <w:rPr>
+          <w:rFonts w:eastAsia="Times New Roman" w:cs="Courier New"/>
+          <w:color w:val="14181F"/>
+          <w:kern w:val="0"/>
+          <w14:ligatures w14:val="none"/>
+        </w:rPr>
+        <w:t xml:space="preserve"> tool</w:t>
+      </w:r>
+    </w:p>
+    <w:p>
+      <w:pPr>
+        <w:tabs>
+          <w:tab w:val="left" w:pos="916"/>
+          <w:tab w:val="left" w:pos="1832"/>
+          <w:tab w:val="left" w:pos="2748"/>
+          <w:tab w:val="left" w:pos="3664"/>
+          <w:tab w:val="left" w:pos="4580"/>
+          <w:tab w:val="left" w:pos="5496"/>
+          <w:tab w:val="left" w:pos="6412"/>
+          <w:tab w:val="left" w:pos="7328"/>
+          <w:tab w:val="left" w:pos="8244"/>
+          <w:tab w:val="left" w:pos="9160"/>
+          <w:tab w:val="left" w:pos="10076"/>
+          <w:tab w:val="left" w:pos="10992"/>
+          <w:tab w:val="left" w:pos="11908"/>
+          <w:tab w:val="left" w:pos="12824"/>
+          <w:tab w:val="left" w:pos="13740"/>
+          <w:tab w:val="left" w:pos="14656"/>
+        </w:tabs>
+        <w:spacing w:after="0" w:line="240" w:lineRule="auto"/>
+        <w:rPr>
+          <w:rFonts w:eastAsia="Times New Roman" w:cs="Courier New"/>
+          <w:color w:val="14181F"/>
+          <w:kern w:val="0"/>
+          <w14:ligatures w14:val="none"/>
+        </w:rPr>
+      </w:pPr>
+      <w:r>
+        <w:rPr>
+          <w:rFonts w:eastAsia="Times New Roman" w:cs="Courier New"/>
+          <w:color w:val="14181F"/>
+          <w:kern w:val="0"/>
+          <w14:ligatures w14:val="none"/>
+        </w:rPr>
+        <w:t xml:space="preserve">Step 8 — </w:t>
+      </w:r>
+      <w:proofErr w:type="spellStart"/>
+      <w:r>
+        <w:rPr>
+          <w:rFonts w:eastAsia="Times New Roman" w:cs="Courier New"/>
+          <w:color w:val="14181F"/>
+          <w:kern w:val="0"/>
+          <w14:ligatures w14:val="none"/>
+        </w:rPr>
+        <w:t>LangChain</w:t>
+      </w:r>
+      <w:proofErr w:type="spellEnd"/>
+      <w:r>
+        <w:rPr>
+          <w:rFonts w:eastAsia="Times New Roman" w:cs="Courier New"/>
+          <w:color w:val="14181F"/>
+          <w:kern w:val="0"/>
+          <w14:ligatures w14:val="none"/>
+        </w:rPr>
+        <w:t xml:space="preserve"> asks Groq: "Now what?"</w:t>
+      </w:r>
+    </w:p>
+    <w:p>
+      <w:pPr>
+        <w:tabs>
+          <w:tab w:val="left" w:pos="916"/>
+          <w:tab w:val="left" w:pos="1832"/>
+          <w:tab w:val="left" w:pos="2748"/>
+          <w:tab w:val="left" w:pos="3664"/>
+          <w:tab w:val="left" w:pos="4580"/>
+          <w:tab w:val="left" w:pos="5496"/>
+          <w:tab w:val="left" w:pos="6412"/>
+          <w:tab w:val="left" w:pos="7328"/>
+          <w:tab w:val="left" w:pos="8244"/>
+          <w:tab w:val="left" w:pos="9160"/>
+          <w:tab w:val="left" w:pos="10076"/>
+          <w:tab w:val="left" w:pos="10992"/>
+          <w:tab w:val="left" w:pos="11908"/>
+          <w:tab w:val="left" w:pos="12824"/>
+          <w:tab w:val="left" w:pos="13740"/>
+          <w:tab w:val="left" w:pos="14656"/>
+        </w:tabs>
+        <w:spacing w:after="0" w:line="240" w:lineRule="auto"/>
+        <w:rPr>
+          <w:rFonts w:eastAsia="Times New Roman" w:cs="Courier New"/>
+          <w:color w:val="14181F"/>
+          <w:kern w:val="0"/>
+          <w14:ligatures w14:val="none"/>
+        </w:rPr>
+      </w:pPr>
+      <w:r>
+        <w:rPr>
+          <w:rFonts w:eastAsia="Times New Roman" w:cs="Courier New"/>
+          <w:color w:val="14181F"/>
+          <w:kern w:val="0"/>
+          <w14:ligatures w14:val="none"/>
+        </w:rPr>
+        <w:t xml:space="preserve">Step 9 — </w:t>
+      </w:r>
+      <w:proofErr w:type="spellStart"/>
+      <w:r>
+        <w:rPr>
+          <w:rFonts w:eastAsia="Times New Roman" w:cs="Courier New"/>
+          <w:color w:val="14181F"/>
+          <w:kern w:val="0"/>
+          <w14:ligatures w14:val="none"/>
+        </w:rPr>
+        <w:t>Groq</w:t>
+      </w:r>
+      <w:proofErr w:type="spellEnd"/>
+      <w:r>
+        <w:rPr>
+          <w:rFonts w:eastAsia="Times New Roman" w:cs="Courier New"/>
+          <w:color w:val="14181F"/>
+          <w:kern w:val="0"/>
+          <w14:ligatures w14:val="none"/>
+        </w:rPr>
+        <w:t xml:space="preserve"> generates final empathetic response</w:t>
+      </w:r>
+    </w:p>
+    <w:p>
+      <w:pPr>
+        <w:tabs>
+          <w:tab w:val="left" w:pos="916"/>
+          <w:tab w:val="left" w:pos="1832"/>
+          <w:tab w:val="left" w:pos="2748"/>
+          <w:tab w:val="left" w:pos="3664"/>
+          <w:tab w:val="left" w:pos="4580"/>
+          <w:tab w:val="left" w:pos="5496"/>
+          <w:tab w:val="left" w:pos="6412"/>
+          <w:tab w:val="left" w:pos="7328"/>
+          <w:tab w:val="left" w:pos="8244"/>
+          <w:tab w:val="left" w:pos="9160"/>
+          <w:tab w:val="left" w:pos="10076"/>
+          <w:tab w:val="left" w:pos="10992"/>
+          <w:tab w:val="left" w:pos="11908"/>
+          <w:tab w:val="left" w:pos="12824"/>
+          <w:tab w:val="left" w:pos="13740"/>
+          <w:tab w:val="left" w:pos="14656"/>
+        </w:tabs>
+        <w:spacing w:after="0" w:line="240" w:lineRule="auto"/>
+        <w:rPr>
+          <w:rFonts w:eastAsia="Times New Roman" w:cs="Courier New"/>
+          <w:color w:val="14181F"/>
+          <w:kern w:val="0"/>
+          <w14:ligatures w14:val="none"/>
+        </w:rPr>
+      </w:pPr>
+      <w:r>
+        <w:rPr>
+          <w:rFonts w:eastAsia="Times New Roman" w:cs="Courier New"/>
+          <w:color w:val="14181F"/>
+          <w:kern w:val="0"/>
+          <w14:ligatures w14:val="none"/>
+        </w:rPr>
+        <w:t xml:space="preserve">Step 10 — </w:t>
+      </w:r>
+      <w:proofErr w:type="spellStart"/>
+      <w:r>
+        <w:rPr>
+          <w:rFonts w:eastAsia="Times New Roman" w:cs="Courier New"/>
+          <w:color w:val="14181F"/>
+          <w:kern w:val="0"/>
+          <w14:ligatures w14:val="none"/>
+        </w:rPr>
+        <w:t>LangChain</w:t>
+      </w:r>
+      <w:proofErr w:type="spellEnd"/>
+      <w:r>
+        <w:rPr>
+          <w:rFonts w:eastAsia="Times New Roman" w:cs="Courier New"/>
+          <w:color w:val="14181F"/>
+          <w:kern w:val="0"/>
+          <w14:ligatures w14:val="none"/>
+        </w:rPr>
+        <w:t xml:space="preserve"> returns response to customer</w:t>
+      </w:r>
+    </w:p>
+    <w:p>
+      <w:pPr>
+        <w:tabs>
+          <w:tab w:val="left" w:pos="916"/>
+          <w:tab w:val="left" w:pos="1832"/>
+          <w:tab w:val="left" w:pos="2748"/>
+          <w:tab w:val="left" w:pos="3664"/>
+          <w:tab w:val="left" w:pos="4580"/>
+          <w:tab w:val="left" w:pos="5496"/>
+          <w:tab w:val="left" w:pos="6412"/>
+          <w:tab w:val="left" w:pos="7328"/>
+          <w:tab w:val="left" w:pos="8244"/>
+          <w:tab w:val="left" w:pos="9160"/>
+          <w:tab w:val="left" w:pos="10076"/>
+          <w:tab w:val="left" w:pos="10992"/>
+          <w:tab w:val="left" w:pos="11908"/>
+          <w:tab w:val="left" w:pos="12824"/>
+          <w:tab w:val="left" w:pos="13740"/>
+          <w:tab w:val="left" w:pos="14656"/>
+        </w:tabs>
+        <w:spacing w:after="0" w:line="240" w:lineRule="auto"/>
+        <w:rPr>
+          <w:rFonts w:eastAsia="Times New Roman" w:cs="Courier New"/>
+          <w:color w:val="14181F"/>
+          <w:kern w:val="0"/>
+          <w14:ligatures w14:val="none"/>
+        </w:rPr>
+      </w:pPr>
+    </w:p>
+    <w:p>
+      <w:pPr>
+        <w:tabs>
+          <w:tab w:val="left" w:pos="916"/>
+          <w:tab w:val="left" w:pos="1832"/>
+          <w:tab w:val="left" w:pos="2748"/>
+          <w:tab w:val="left" w:pos="3664"/>
+          <w:tab w:val="left" w:pos="4580"/>
+          <w:tab w:val="left" w:pos="5496"/>
+          <w:tab w:val="left" w:pos="6412"/>
+          <w:tab w:val="left" w:pos="7328"/>
+          <w:tab w:val="left" w:pos="8244"/>
+          <w:tab w:val="left" w:pos="9160"/>
+          <w:tab w:val="left" w:pos="10076"/>
+          <w:tab w:val="left" w:pos="10992"/>
+          <w:tab w:val="left" w:pos="11908"/>
+          <w:tab w:val="left" w:pos="12824"/>
+          <w:tab w:val="left" w:pos="13740"/>
+          <w:tab w:val="left" w:pos="14656"/>
+        </w:tabs>
+        <w:spacing w:after="0" w:line="240" w:lineRule="auto"/>
+        <w:rPr>
+          <w:rStyle w:val="apple-converted-space"/>
+          <w:color w:val="000000"/>
+        </w:rPr>
+      </w:pPr>
+      <w:r>
+        <w:rPr>
+          <w:color w:val="000000"/>
+        </w:rPr>
+        <w:t>boto3 → Python library to connect to AWS</w:t>
+      </w:r>
+      <w:r>
+        <w:rPr>
+          <w:rStyle w:val="apple-converted-space"/>
+          <w:color w:val="000000"/>
+        </w:rPr>
+        <w:t> </w:t>
+      </w:r>
+    </w:p>
+    <w:p>
+      <w:pPr>
+        <w:tabs>
+          <w:tab w:val="left" w:pos="916"/>
+          <w:tab w:val="left" w:pos="1832"/>
+          <w:tab w:val="left" w:pos="2748"/>
+          <w:tab w:val="left" w:pos="3664"/>
+          <w:tab w:val="left" w:pos="4580"/>
+          <w:tab w:val="left" w:pos="5496"/>
+          <w:tab w:val="left" w:pos="6412"/>
+          <w:tab w:val="left" w:pos="7328"/>
+          <w:tab w:val="left" w:pos="8244"/>
+          <w:tab w:val="left" w:pos="9160"/>
+          <w:tab w:val="left" w:pos="10076"/>
+          <w:tab w:val="left" w:pos="10992"/>
+          <w:tab w:val="left" w:pos="11908"/>
+          <w:tab w:val="left" w:pos="12824"/>
+          <w:tab w:val="left" w:pos="13740"/>
+          <w:tab w:val="left" w:pos="14656"/>
+        </w:tabs>
+        <w:spacing w:after="0" w:line="240" w:lineRule="auto"/>
+        <w:rPr>
+          <w:rStyle w:val="apple-converted-space"/>
+          <w:color w:val="000000"/>
+        </w:rPr>
+      </w:pPr>
+      <w:r>
+        <w:rPr>
+          <w:color w:val="000000"/>
+        </w:rPr>
+        <w:t>psycopg2 → Python library to connect to PostgreSQL</w:t>
+      </w:r>
+      <w:r>
+        <w:rPr>
+          <w:rStyle w:val="apple-converted-space"/>
+          <w:color w:val="000000"/>
+        </w:rPr>
+        <w:t> </w:t>
+      </w:r>
+    </w:p>
+    <w:p>
+      <w:pPr>
+        <w:tabs>
+          <w:tab w:val="left" w:pos="916"/>
+          <w:tab w:val="left" w:pos="1832"/>
+          <w:tab w:val="left" w:pos="2748"/>
+          <w:tab w:val="left" w:pos="3664"/>
+          <w:tab w:val="left" w:pos="4580"/>
+          <w:tab w:val="left" w:pos="5496"/>
+          <w:tab w:val="left" w:pos="6412"/>
+          <w:tab w:val="left" w:pos="7328"/>
+          <w:tab w:val="left" w:pos="8244"/>
+          <w:tab w:val="left" w:pos="9160"/>
+          <w:tab w:val="left" w:pos="10076"/>
+          <w:tab w:val="left" w:pos="10992"/>
+          <w:tab w:val="left" w:pos="11908"/>
+          <w:tab w:val="left" w:pos="12824"/>
+          <w:tab w:val="left" w:pos="13740"/>
+          <w:tab w:val="left" w:pos="14656"/>
+        </w:tabs>
+        <w:spacing w:after="0" w:line="240" w:lineRule="auto"/>
+        <w:rPr>
+          <w:rStyle w:val="apple-converted-space"/>
+          <w:color w:val="000000"/>
+        </w:rPr>
+      </w:pPr>
+      <w:proofErr w:type="spellStart"/>
+      <w:r>
+        <w:rPr>
+          <w:color w:val="000000"/>
+        </w:rPr>
+        <w:t>fastapi</w:t>
+      </w:r>
+      <w:proofErr w:type="spellEnd"/>
+      <w:r>
+        <w:rPr>
+          <w:color w:val="000000"/>
+        </w:rPr>
+        <w:t xml:space="preserve"> → Python library to build APIs</w:t>
+      </w:r>
+      <w:r>
+        <w:rPr>
+          <w:rStyle w:val="apple-converted-space"/>
+          <w:color w:val="000000"/>
+        </w:rPr>
+        <w:t> </w:t>
+      </w:r>
+    </w:p>
+    <w:p>
+      <w:pPr>
+        <w:tabs>
+          <w:tab w:val="left" w:pos="916"/>
+          <w:tab w:val="left" w:pos="1832"/>
+          <w:tab w:val="left" w:pos="2748"/>
+          <w:tab w:val="left" w:pos="3664"/>
+          <w:tab w:val="left" w:pos="4580"/>
+          <w:tab w:val="left" w:pos="5496"/>
+          <w:tab w:val="left" w:pos="6412"/>
+          <w:tab w:val="left" w:pos="7328"/>
+          <w:tab w:val="left" w:pos="8244"/>
+          <w:tab w:val="left" w:pos="9160"/>
+          <w:tab w:val="left" w:pos="10076"/>
+          <w:tab w:val="left" w:pos="10992"/>
+          <w:tab w:val="left" w:pos="11908"/>
+          <w:tab w:val="left" w:pos="12824"/>
+          <w:tab w:val="left" w:pos="13740"/>
+          <w:tab w:val="left" w:pos="14656"/>
+        </w:tabs>
+        <w:spacing w:after="0" w:line="240" w:lineRule="auto"/>
+        <w:rPr>
+          <w:rFonts w:eastAsia="Times New Roman" w:cs="Courier New"/>
+          <w:color w:val="14181F"/>
+          <w:kern w:val="0"/>
+          <w14:ligatures w14:val="none"/>
+        </w:rPr>
+      </w:pPr>
+      <w:proofErr w:type="spellStart"/>
+      <w:r>
+        <w:rPr>
+          <w:color w:val="000000"/>
+        </w:rPr>
+        <w:t>langchain</w:t>
+      </w:r>
+      <w:proofErr w:type="spellEnd"/>
+      <w:r>
+        <w:rPr>
+          <w:color w:val="000000"/>
+        </w:rPr>
+        <w:t xml:space="preserve"> → Python library to build agentic AI</w:t>
+      </w:r>
+    </w:p>
     <w:p>
       <w:pPr>
         <w:tabs>
@@ -4024,6 +4969,19 @@
     <w:basedOn w:val="DefaultParagraphFont"/>
     <w:rsid w:val="002B793E"/>
   </w:style>
+  <w:style w:type="paragraph" w:customStyle="1" w:styleId="font-claude-response-body">
+    <w:name w:val="font-claude-response-body"/>
+    <w:basedOn w:val="Normal"/>
+    <w:rsid w:val="00A86E30"/>
+    <w:pPr>
+      <w:spacing w:before="100" w:beforeAutospacing="1" w:after="100" w:afterAutospacing="1" w:line="240" w:lineRule="auto"/>
+    </w:pPr>
+    <w:rPr>
+      <w:rFonts w:ascii="Times New Roman" w:eastAsia="Times New Roman" w:hAnsi="Times New Roman" w:cs="Times New Roman"/>
+      <w:kern w:val="0"/>
+      <w14:ligatures w14:val="none"/>
+    </w:rPr>
+  </w:style>
 </w:styles>
 </file>
 

</xml_diff>

<commit_message>
Add Vue frontend, Node.js BFF, and Python FastAPI layer
- Add Vue.js frontend with chat and tickets views
- Add Node.js/Express BFF connecting Vue to Python
- Add FastAPI endpoints for chat and tickets
- Add ticket fetching from PostgreSQL
- Add Groq AI integration
</commit_message>
<xml_diff>
--- a/Customer Agent Project.docx
+++ b/Customer Agent Project.docx
@@ -319,7 +319,6 @@
           <w:color w:val="000000"/>
         </w:rPr>
       </w:pPr>
-      <w:proofErr w:type="spellStart"/>
       <w:r>
         <w:rPr>
           <w:rStyle w:val="apple-converted-space"/>
@@ -327,6 +326,7 @@
         </w:rPr>
         <w:t> </w:t>
       </w:r>
+      <w:proofErr w:type="spellStart"/>
       <w:r>
         <w:rPr>
           <w:color w:val="000000"/>
@@ -495,7 +495,6 @@
           <w:color w:val="000000"/>
         </w:rPr>
       </w:pPr>
-      <w:proofErr w:type="spellStart"/>
       <w:r>
         <w:rPr>
           <w:rStyle w:val="apple-converted-space"/>
@@ -503,6 +502,7 @@
         </w:rPr>
         <w:t> </w:t>
       </w:r>
+      <w:proofErr w:type="spellStart"/>
       <w:r>
         <w:rPr>
           <w:color w:val="000000"/>
@@ -544,7 +544,6 @@
           <w:color w:val="000000"/>
         </w:rPr>
       </w:pPr>
-      <w:proofErr w:type="spellStart"/>
       <w:r>
         <w:rPr>
           <w:rStyle w:val="apple-converted-space"/>
@@ -552,6 +551,7 @@
         </w:rPr>
         <w:t> </w:t>
       </w:r>
+      <w:proofErr w:type="spellStart"/>
       <w:r>
         <w:rPr>
           <w:color w:val="000000"/>
@@ -606,7 +606,6 @@
           <w:color w:val="000000"/>
         </w:rPr>
       </w:pPr>
-      <w:proofErr w:type="spellStart"/>
       <w:r>
         <w:rPr>
           <w:rStyle w:val="apple-converted-space"/>
@@ -614,6 +613,7 @@
         </w:rPr>
         <w:t> </w:t>
       </w:r>
+      <w:proofErr w:type="spellStart"/>
       <w:r>
         <w:rPr>
           <w:color w:val="000000"/>
@@ -655,7 +655,6 @@
           <w:color w:val="000000"/>
         </w:rPr>
       </w:pPr>
-      <w:proofErr w:type="spellStart"/>
       <w:r>
         <w:rPr>
           <w:rStyle w:val="apple-converted-space"/>
@@ -663,6 +662,7 @@
         </w:rPr>
         <w:t> </w:t>
       </w:r>
+      <w:proofErr w:type="spellStart"/>
       <w:r>
         <w:rPr>
           <w:color w:val="000000"/>
@@ -698,7 +698,6 @@
       </w:r>
     </w:p>
     <w:p>
-      <w:proofErr w:type="spellStart"/>
       <w:r>
         <w:rPr>
           <w:rStyle w:val="apple-converted-space"/>
@@ -706,6 +705,7 @@
         </w:rPr>
         <w:t> </w:t>
       </w:r>
+      <w:proofErr w:type="spellStart"/>
       <w:r>
         <w:rPr>
           <w:color w:val="000000"/>
@@ -876,36 +876,16 @@
           <w:kern w:val="0"/>
           <w14:ligatures w14:val="none"/>
         </w:rPr>
-        <w:t xml:space="preserve">, the sentiment is detected, searched the knowledge base for billing answers, generated </w:t>
-      </w:r>
-      <w:proofErr w:type="spellStart"/>
-      <w:r>
-        <w:rPr>
-          <w:rFonts w:ascii="Times New Roman" w:eastAsia="Times New Roman" w:hAnsi="Times New Roman" w:cs="Times New Roman"/>
-          <w:kern w:val="0"/>
-          <w14:ligatures w14:val="none"/>
-        </w:rPr>
-        <w:t>fpor</w:t>
-      </w:r>
-      <w:proofErr w:type="spellEnd"/>
-      <w:r>
-        <w:rPr>
-          <w:rFonts w:ascii="Times New Roman" w:eastAsia="Times New Roman" w:hAnsi="Times New Roman" w:cs="Times New Roman"/>
-          <w:kern w:val="0"/>
-          <w14:ligatures w14:val="none"/>
-        </w:rPr>
-        <w:t xml:space="preserve"> intelligent response, saved </w:t>
-      </w:r>
-      <w:proofErr w:type="spellStart"/>
-      <w:r>
-        <w:rPr>
-          <w:rFonts w:ascii="Times New Roman" w:eastAsia="Times New Roman" w:hAnsi="Times New Roman" w:cs="Times New Roman"/>
-          <w:kern w:val="0"/>
-          <w14:ligatures w14:val="none"/>
-        </w:rPr>
-        <w:t>everuything</w:t>
-      </w:r>
-      <w:proofErr w:type="spellEnd"/>
+        <w:t xml:space="preserve">, the sentiment is detected, searched the knowledge base for billing answers, generated for intelligent response, saved </w:t>
+      </w:r>
+      <w:r>
+        <w:rPr>
+          <w:rFonts w:ascii="Times New Roman" w:eastAsia="Times New Roman" w:hAnsi="Times New Roman" w:cs="Times New Roman"/>
+          <w:kern w:val="0"/>
+          <w14:ligatures w14:val="none"/>
+        </w:rPr>
+        <w:t>everything</w:t>
+      </w:r>
       <w:r>
         <w:rPr>
           <w:rFonts w:ascii="Times New Roman" w:eastAsia="Times New Roman" w:hAnsi="Times New Roman" w:cs="Times New Roman"/>
@@ -1155,43 +1135,23 @@
           <w:kern w:val="0"/>
           <w14:ligatures w14:val="none"/>
         </w:rPr>
-        <w:t xml:space="preserve"> is created with the database, username and </w:t>
-      </w:r>
-      <w:proofErr w:type="gramStart"/>
-      <w:r>
-        <w:rPr>
-          <w:rFonts w:ascii="Times New Roman" w:eastAsia="Times New Roman" w:hAnsi="Times New Roman" w:cs="Times New Roman"/>
-          <w:kern w:val="0"/>
-          <w14:ligatures w14:val="none"/>
-        </w:rPr>
-        <w:t>password  and</w:t>
-      </w:r>
-      <w:proofErr w:type="gramEnd"/>
-      <w:r>
-        <w:rPr>
-          <w:rFonts w:ascii="Times New Roman" w:eastAsia="Times New Roman" w:hAnsi="Times New Roman" w:cs="Times New Roman"/>
-          <w:kern w:val="0"/>
-          <w14:ligatures w14:val="none"/>
-        </w:rPr>
-        <w:t xml:space="preserve"> </w:t>
-      </w:r>
-      <w:proofErr w:type="gramStart"/>
-      <w:r>
-        <w:rPr>
-          <w:rFonts w:ascii="Times New Roman" w:eastAsia="Times New Roman" w:hAnsi="Times New Roman" w:cs="Times New Roman"/>
-          <w:kern w:val="0"/>
-          <w14:ligatures w14:val="none"/>
-        </w:rPr>
-        <w:t>it</w:t>
-      </w:r>
-      <w:proofErr w:type="gramEnd"/>
-      <w:r>
-        <w:rPr>
-          <w:rFonts w:ascii="Times New Roman" w:eastAsia="Times New Roman" w:hAnsi="Times New Roman" w:cs="Times New Roman"/>
-          <w:kern w:val="0"/>
-          <w14:ligatures w14:val="none"/>
-        </w:rPr>
-        <w:t xml:space="preserve"> open port 5432 and runs the </w:t>
+        <w:t xml:space="preserve"> is created with the database, username and password  and it open</w:t>
+      </w:r>
+      <w:r>
+        <w:rPr>
+          <w:rFonts w:ascii="Times New Roman" w:eastAsia="Times New Roman" w:hAnsi="Times New Roman" w:cs="Times New Roman"/>
+          <w:kern w:val="0"/>
+          <w14:ligatures w14:val="none"/>
+        </w:rPr>
+        <w:t>s</w:t>
+      </w:r>
+      <w:r>
+        <w:rPr>
+          <w:rFonts w:ascii="Times New Roman" w:eastAsia="Times New Roman" w:hAnsi="Times New Roman" w:cs="Times New Roman"/>
+          <w:kern w:val="0"/>
+          <w14:ligatures w14:val="none"/>
+        </w:rPr>
+        <w:t xml:space="preserve"> port 5432 and runs the </w:t>
       </w:r>
       <w:proofErr w:type="spellStart"/>
       <w:r>
@@ -2906,7 +2866,27 @@
           <w:kern w:val="0"/>
           <w14:ligatures w14:val="none"/>
         </w:rPr>
-        <w:t xml:space="preserve"> asks Groq: "What should I do first?"</w:t>
+        <w:t xml:space="preserve"> asks </w:t>
+      </w:r>
+      <w:proofErr w:type="spellStart"/>
+      <w:r>
+        <w:rPr>
+          <w:rFonts w:eastAsia="Times New Roman" w:cs="Courier New"/>
+          <w:color w:val="14181F"/>
+          <w:kern w:val="0"/>
+          <w14:ligatures w14:val="none"/>
+        </w:rPr>
+        <w:t>Groq</w:t>
+      </w:r>
+      <w:proofErr w:type="spellEnd"/>
+      <w:r>
+        <w:rPr>
+          <w:rFonts w:eastAsia="Times New Roman" w:cs="Courier New"/>
+          <w:color w:val="14181F"/>
+          <w:kern w:val="0"/>
+          <w14:ligatures w14:val="none"/>
+        </w:rPr>
+        <w:t>: "What should I do first?"</w:t>
       </w:r>
     </w:p>
     <w:p>
@@ -3100,7 +3080,27 @@
           <w:kern w:val="0"/>
           <w14:ligatures w14:val="none"/>
         </w:rPr>
-        <w:t xml:space="preserve"> asks Groq: "What next?"</w:t>
+        <w:t xml:space="preserve"> asks </w:t>
+      </w:r>
+      <w:proofErr w:type="spellStart"/>
+      <w:r>
+        <w:rPr>
+          <w:rFonts w:eastAsia="Times New Roman" w:cs="Courier New"/>
+          <w:color w:val="14181F"/>
+          <w:kern w:val="0"/>
+          <w14:ligatures w14:val="none"/>
+        </w:rPr>
+        <w:t>Groq</w:t>
+      </w:r>
+      <w:proofErr w:type="spellEnd"/>
+      <w:r>
+        <w:rPr>
+          <w:rFonts w:eastAsia="Times New Roman" w:cs="Courier New"/>
+          <w:color w:val="14181F"/>
+          <w:kern w:val="0"/>
+          <w14:ligatures w14:val="none"/>
+        </w:rPr>
+        <w:t>: "What next?"</w:t>
       </w:r>
     </w:p>
     <w:p>
@@ -3294,7 +3294,27 @@
           <w:kern w:val="0"/>
           <w14:ligatures w14:val="none"/>
         </w:rPr>
-        <w:t xml:space="preserve"> asks Groq: "Now what?"</w:t>
+        <w:t xml:space="preserve"> asks </w:t>
+      </w:r>
+      <w:proofErr w:type="spellStart"/>
+      <w:r>
+        <w:rPr>
+          <w:rFonts w:eastAsia="Times New Roman" w:cs="Courier New"/>
+          <w:color w:val="14181F"/>
+          <w:kern w:val="0"/>
+          <w14:ligatures w14:val="none"/>
+        </w:rPr>
+        <w:t>Groq</w:t>
+      </w:r>
+      <w:proofErr w:type="spellEnd"/>
+      <w:r>
+        <w:rPr>
+          <w:rFonts w:eastAsia="Times New Roman" w:cs="Courier New"/>
+          <w:color w:val="14181F"/>
+          <w:kern w:val="0"/>
+          <w14:ligatures w14:val="none"/>
+        </w:rPr>
+        <w:t>: "Now what?"</w:t>
       </w:r>
     </w:p>
     <w:p>

</xml_diff>